<commit_message>
docs: Tahap 5 quality review for SBY track — fix framing violation in 15 stems
Ran the 7-criteria Tahap 5 checklist against the 50 final SBY questions.
6/7 criteria clean (key accuracy, stem ambiguity, length-cue, weak
distractors, register, copyright). Found 15/50 stems (30%) using
"menurut pengajaran ini" framing, substantively the same violation as
the explicitly forbidden "menurut kelas..." pattern — fixed by removing
the clause (answer keys and options unchanged). Regenerated the
candidate reference table/docx from the corrected Tahap 3 sources.

Co-Authored-By: Claude Sonnet 5 <noreply@anthropic.com>
</commit_message>
<xml_diff>
--- a/messages/Truth_M07-09_SBY_CandidateReference.docx
+++ b/messages/Truth_M07-09_SBY_CandidateReference.docx
@@ -5076,7 +5076,7 @@
               <w:rPr>
                 <w:sz w:val="16"/>
               </w:rPr>
-              <w:t>Hidup dalam damai dengan semua orang, menurut pengajaran ini, harus bersumber dari...</w:t>
+              <w:t>Hidup dalam damai dengan semua orang harus bersumber dari...</w:t>
             </w:r>
           </w:p>
         </w:tc>
@@ -6602,7 +6602,7 @@
               <w:rPr>
                 <w:sz w:val="16"/>
               </w:rPr>
-              <w:t>Gereja-gereja, menurut pengajaran ini, perlu memiliki satu...</w:t>
+              <w:t>Gereja-gereja perlu memiliki satu...</w:t>
             </w:r>
           </w:p>
         </w:tc>
@@ -7910,7 +7910,7 @@
               <w:rPr>
                 <w:sz w:val="16"/>
               </w:rPr>
-              <w:t>Hasil akhir dari penyaluran Ilahi dalam kaum beriman, menurut pengajaran ini, adalah ketaatan iman yang membawa orang untuk...</w:t>
+              <w:t>Hasil akhir dari penyaluran Ilahi dalam kaum beriman adalah ketaatan iman yang membawa orang untuk...</w:t>
             </w:r>
           </w:p>
         </w:tc>
@@ -9280,7 +9280,7 @@
               <w:rPr>
                 <w:sz w:val="16"/>
               </w:rPr>
-              <w:t>Istilah "persekutuan" terhadap Kristus, menurut pengajaran ini, mengandung unsur apa?</w:t>
+              <w:t>Istilah "persekutuan" terhadap Kristus mengandung unsur apa?</w:t>
             </w:r>
           </w:p>
         </w:tc>
@@ -9934,7 +9934,7 @@
               <w:rPr>
                 <w:sz w:val="16"/>
               </w:rPr>
-              <w:t>Hikmat Allah, menurut pengajaran ini, didefinisikan sebagai...</w:t>
+              <w:t>Hikmat Allah didefinisikan sebagai...</w:t>
             </w:r>
           </w:p>
         </w:tc>
@@ -10806,7 +10806,7 @@
               <w:rPr>
                 <w:sz w:val="16"/>
               </w:rPr>
-              <w:t>Penebusan Kristus, menurut pengajaran ini, mencakup bukan hanya hidup dan perilaku kaum beriman hari ini, melainkan juga...</w:t>
+              <w:t>Penebusan Kristus mencakup bukan hanya hidup dan perilaku kaum beriman hari ini, melainkan juga...</w:t>
             </w:r>
           </w:p>
         </w:tc>
@@ -13048,7 +13048,7 @@
               <w:rPr>
                 <w:sz w:val="16"/>
               </w:rPr>
-              <w:t>Akar yang dalam yang harus dimiliki kaum beriman, menurut pengajaran ini, berisi unsur apa dari Allah?</w:t>
+              <w:t>Akar yang dalam yang harus dimiliki kaum beriman berisi unsur apa dari Allah?</w:t>
             </w:r>
           </w:p>
         </w:tc>
@@ -13484,7 +13484,7 @@
               <w:rPr>
                 <w:sz w:val="16"/>
               </w:rPr>
-              <w:t>Pertumbuhan kaum beriman sebagai ladang Allah, menurut pengajaran ini, ditujukan untuk...</w:t>
+              <w:t>Pertumbuhan kaum beriman sebagai ladang Allah ditujukan untuk...</w:t>
             </w:r>
           </w:p>
         </w:tc>
@@ -13920,7 +13920,7 @@
               <w:rPr>
                 <w:sz w:val="16"/>
               </w:rPr>
-              <w:t>Ujian dengan api terhadap bahan bangunan gereja, menurut pengajaran ini, bertujuan agar...</w:t>
+              <w:t>Ujian dengan api terhadap bahan bangunan gereja bertujuan agar...</w:t>
             </w:r>
           </w:p>
         </w:tc>
@@ -15010,7 +15010,7 @@
               <w:rPr>
                 <w:sz w:val="16"/>
               </w:rPr>
-              <w:t>Menurut pengajaran ini, bejana tanah liat yang berisi harta Kristus perlu dijaga agar tidak...</w:t>
+              <w:t>Bejana tanah liat yang berisi harta Kristus perlu dijaga agar tidak...</w:t>
             </w:r>
           </w:p>
         </w:tc>
@@ -15228,7 +15228,7 @@
               <w:rPr>
                 <w:sz w:val="16"/>
               </w:rPr>
-              <w:t>Menurut pengajaran ini, berbahasa lidah tidak membangun Tubuh karena hanya menggunakan tubuh, tanpa melibatkan bagian manusia yang mana?</w:t>
+              <w:t>Berbahasa lidah tidak membangun Tubuh karena hanya menggunakan tubuh, tanpa melibatkan bagian manusia yang mana?</w:t>
             </w:r>
           </w:p>
         </w:tc>
@@ -15664,7 +15664,7 @@
               <w:rPr>
                 <w:sz w:val="16"/>
               </w:rPr>
-              <w:t>Manusia batiniah kaum beriman, menurut pengajaran ini, diperbarui dari sehari ke sehari, sedangkan manusia lahiriah...</w:t>
+              <w:t>Manusia batiniah kaum beriman diperbarui dari sehari ke sehari, sedangkan manusia lahiriah...</w:t>
             </w:r>
           </w:p>
         </w:tc>
@@ -15882,7 +15882,7 @@
               <w:rPr>
                 <w:sz w:val="16"/>
               </w:rPr>
-              <w:t>Kelimpahan penyataan/visi yang diterima Rasul Paulus (2 Korintus 12), menurut pengajaran ini, membuat dia diberi apa agar tidak meninggikan diri?</w:t>
+              <w:t>Kelimpahan penyataan/visi yang diterima Rasul Paulus (2 Korintus 12) membuat dia diberi apa agar tidak meninggikan diri?</w:t>
             </w:r>
           </w:p>
         </w:tc>
@@ -16100,7 +16100,7 @@
               <w:rPr>
                 <w:sz w:val="16"/>
               </w:rPr>
-              <w:t>Jawaban Tuhan atas permohonan Paulus terkait duri dalam daging, menurut pengajaran ini, menyatakan bahwa kuasa Tuhan menjadi sempurna dalam...</w:t>
+              <w:t>Jawaban Tuhan atas permohonan Paulus terkait duri dalam daging menyatakan bahwa kuasa Tuhan menjadi sempurna dalam...</w:t>
             </w:r>
           </w:p>
         </w:tc>
@@ -16318,7 +16318,7 @@
               <w:rPr>
                 <w:sz w:val="16"/>
               </w:rPr>
-              <w:t>Menurut pengajaran ini (merujuk 1 Korintus 15:10), kekuatan yang bekerja dalam diri rasul untuk berjerih lelah lebih banyak berasal dari...</w:t>
+              <w:t>Merujuk 1 Korintus 15:10, kekuatan yang bekerja dalam diri rasul untuk berjerih lelah lebih banyak berasal dari...</w:t>
             </w:r>
           </w:p>
         </w:tc>
@@ -16965,7 +16965,7 @@
         <w:t>Cara pakai untuk QC manual:</w:t>
       </w:r>
       <w:r>
-        <w:t xml:space="preserve"> jika suatu soal Terpilih dinilai perlu diganti (mis. ambigu, kunci meragukan), cari kandidat Cadangan lain dari </w:t>
+        <w:t xml:space="preserve"> jika suatu soal Terpilih dinilai perlu diganti, cari kandidat Cadangan lain dari </w:t>
       </w:r>
       <w:r>
         <w:rPr>

</xml_diff>